<commit_message>
Update 周五 2026/10/16 17:32:59
</commit_message>
<xml_diff>
--- a/模板库/ku/上汽商用车.docx
+++ b/模板库/ku/上汽商用车.docx
@@ -80,6 +80,12 @@
             <w:insideH w:val="single" w:color="auto" w:sz="4" w:space="0"/>
             <w:insideV w:val="single" w:color="auto" w:sz="4" w:space="0"/>
           </w:tblBorders>
+          <w:tblCellMar>
+            <w:top w:w="0" w:type="dxa"/>
+            <w:left w:w="108" w:type="dxa"/>
+            <w:bottom w:w="0" w:type="dxa"/>
+            <w:right w:w="108" w:type="dxa"/>
+          </w:tblCellMar>
         </w:tblPrEx>
         <w:trPr>
           <w:trHeight w:val="935" w:hRule="atLeast"/>
@@ -987,14 +993,8 @@
     </w:p>
     <w:p>
       <w:pPr>
-        <w:pStyle w:val="9"/>
-        <w:keepNext w:val="0"/>
-        <w:keepLines w:val="0"/>
-        <w:widowControl w:val="0"/>
-        <w:suppressLineNumbers w:val="0"/>
-        <w:spacing w:before="0" w:beforeAutospacing="0" w:after="0" w:afterAutospacing="0"/>
-        <w:ind w:left="0" w:right="0"/>
-        <w:jc w:val="both"/>
+        <w:spacing w:line="360" w:lineRule="auto"/>
+        <w:jc w:val="left"/>
         <w:rPr>
           <w:rFonts w:hint="eastAsia" w:ascii="宋体" w:hAnsi="宋体" w:eastAsia="宋体" w:cs="宋体"/>
           <w:b w:val="0"/>
@@ -1020,14 +1020,8 @@
     </w:p>
     <w:p>
       <w:pPr>
-        <w:pStyle w:val="9"/>
-        <w:keepNext w:val="0"/>
-        <w:keepLines w:val="0"/>
-        <w:widowControl w:val="0"/>
-        <w:suppressLineNumbers w:val="0"/>
-        <w:spacing w:before="0" w:beforeAutospacing="0" w:after="0" w:afterAutospacing="0"/>
-        <w:ind w:left="0" w:right="0"/>
-        <w:jc w:val="both"/>
+        <w:spacing w:line="360" w:lineRule="auto"/>
+        <w:jc w:val="left"/>
         <w:rPr>
           <w:rFonts w:hint="eastAsia" w:ascii="宋体" w:hAnsi="宋体" w:eastAsia="宋体" w:cs="宋体"/>
           <w:b w:val="0"/>
@@ -1053,14 +1047,8 @@
     </w:p>
     <w:p>
       <w:pPr>
-        <w:pStyle w:val="9"/>
-        <w:keepNext w:val="0"/>
-        <w:keepLines w:val="0"/>
-        <w:widowControl w:val="0"/>
-        <w:suppressLineNumbers w:val="0"/>
-        <w:spacing w:before="0" w:beforeAutospacing="0" w:after="0" w:afterAutospacing="0"/>
-        <w:ind w:left="0" w:right="0"/>
-        <w:jc w:val="both"/>
+        <w:spacing w:line="360" w:lineRule="auto"/>
+        <w:jc w:val="left"/>
         <w:rPr>
           <w:rFonts w:hint="eastAsia" w:ascii="宋体" w:hAnsi="宋体" w:eastAsia="宋体" w:cs="宋体"/>
           <w:b w:val="0"/>
@@ -1074,14 +1062,8 @@
     </w:p>
     <w:p>
       <w:pPr>
-        <w:pStyle w:val="9"/>
-        <w:keepNext w:val="0"/>
-        <w:keepLines w:val="0"/>
-        <w:widowControl w:val="0"/>
-        <w:suppressLineNumbers w:val="0"/>
-        <w:spacing w:before="0" w:beforeAutospacing="0" w:after="0" w:afterAutospacing="0"/>
-        <w:ind w:left="0" w:right="0"/>
-        <w:jc w:val="both"/>
+        <w:spacing w:line="360" w:lineRule="auto"/>
+        <w:jc w:val="left"/>
         <w:rPr>
           <w:rFonts w:hint="eastAsia" w:ascii="宋体" w:hAnsi="宋体" w:eastAsia="宋体" w:cs="宋体"/>
           <w:b w:val="0"/>
@@ -1104,17 +1086,13 @@
         </w:rPr>
         <w:t>功能状态B</w:t>
       </w:r>
+      <w:bookmarkStart w:id="0" w:name="_GoBack"/>
+      <w:bookmarkEnd w:id="0"/>
     </w:p>
     <w:p>
       <w:pPr>
-        <w:pStyle w:val="9"/>
-        <w:keepNext w:val="0"/>
-        <w:keepLines w:val="0"/>
-        <w:widowControl w:val="0"/>
-        <w:suppressLineNumbers w:val="0"/>
-        <w:spacing w:before="0" w:beforeAutospacing="0" w:after="0" w:afterAutospacing="0"/>
-        <w:ind w:left="0" w:right="0"/>
-        <w:jc w:val="both"/>
+        <w:spacing w:line="360" w:lineRule="auto"/>
+        <w:jc w:val="left"/>
         <w:rPr>
           <w:rFonts w:hint="eastAsia" w:ascii="宋体" w:hAnsi="宋体" w:eastAsia="宋体" w:cs="宋体"/>
           <w:b w:val="0"/>
@@ -1140,14 +1118,8 @@
     </w:p>
     <w:p>
       <w:pPr>
-        <w:pStyle w:val="9"/>
-        <w:keepNext w:val="0"/>
-        <w:keepLines w:val="0"/>
-        <w:widowControl w:val="0"/>
-        <w:suppressLineNumbers w:val="0"/>
-        <w:spacing w:before="0" w:beforeAutospacing="0" w:after="0" w:afterAutospacing="0"/>
-        <w:ind w:left="0" w:right="0"/>
-        <w:jc w:val="both"/>
+        <w:spacing w:line="360" w:lineRule="auto"/>
+        <w:jc w:val="left"/>
         <w:rPr>
           <w:rFonts w:hint="eastAsia" w:ascii="宋体" w:hAnsi="宋体" w:eastAsia="宋体" w:cs="宋体"/>
           <w:b w:val="0"/>
@@ -1161,14 +1133,8 @@
     </w:p>
     <w:p>
       <w:pPr>
-        <w:pStyle w:val="9"/>
-        <w:keepNext w:val="0"/>
-        <w:keepLines w:val="0"/>
-        <w:widowControl w:val="0"/>
-        <w:suppressLineNumbers w:val="0"/>
-        <w:spacing w:before="0" w:beforeAutospacing="0" w:after="0" w:afterAutospacing="0"/>
-        <w:ind w:left="0" w:right="0"/>
-        <w:jc w:val="both"/>
+        <w:spacing w:line="360" w:lineRule="auto"/>
+        <w:jc w:val="left"/>
         <w:rPr>
           <w:rFonts w:hint="eastAsia" w:ascii="宋体" w:hAnsi="宋体" w:eastAsia="宋体" w:cs="宋体"/>
           <w:b w:val="0"/>
@@ -1194,14 +1160,8 @@
     </w:p>
     <w:p>
       <w:pPr>
-        <w:pStyle w:val="9"/>
-        <w:keepNext w:val="0"/>
-        <w:keepLines w:val="0"/>
-        <w:widowControl w:val="0"/>
-        <w:suppressLineNumbers w:val="0"/>
-        <w:spacing w:before="0" w:beforeAutospacing="0" w:after="0" w:afterAutospacing="0"/>
-        <w:ind w:left="0" w:right="0"/>
-        <w:jc w:val="both"/>
+        <w:spacing w:line="360" w:lineRule="auto"/>
+        <w:jc w:val="left"/>
         <w:rPr>
           <w:rFonts w:hint="eastAsia" w:ascii="宋体" w:hAnsi="宋体" w:eastAsia="宋体" w:cs="宋体"/>
           <w:b w:val="0"/>
@@ -1227,14 +1187,8 @@
     </w:p>
     <w:p>
       <w:pPr>
-        <w:pStyle w:val="9"/>
-        <w:keepNext w:val="0"/>
-        <w:keepLines w:val="0"/>
-        <w:widowControl w:val="0"/>
-        <w:suppressLineNumbers w:val="0"/>
-        <w:spacing w:before="0" w:beforeAutospacing="0" w:after="0" w:afterAutospacing="0"/>
-        <w:ind w:left="0" w:right="0"/>
-        <w:jc w:val="both"/>
+        <w:spacing w:line="360" w:lineRule="auto"/>
+        <w:jc w:val="left"/>
         <w:rPr>
           <w:rFonts w:hint="eastAsia" w:ascii="宋体" w:hAnsi="宋体" w:eastAsia="宋体" w:cs="宋体"/>
           <w:b w:val="0"/>
@@ -1248,14 +1202,8 @@
     </w:p>
     <w:p>
       <w:pPr>
-        <w:pStyle w:val="9"/>
-        <w:keepNext w:val="0"/>
-        <w:keepLines w:val="0"/>
-        <w:widowControl w:val="0"/>
-        <w:suppressLineNumbers w:val="0"/>
-        <w:spacing w:before="0" w:beforeAutospacing="0" w:after="0" w:afterAutospacing="0"/>
-        <w:ind w:left="0" w:right="0"/>
-        <w:jc w:val="both"/>
+        <w:spacing w:line="360" w:lineRule="auto"/>
+        <w:jc w:val="left"/>
         <w:rPr>
           <w:rFonts w:hint="eastAsia" w:ascii="宋体" w:hAnsi="宋体" w:eastAsia="宋体" w:cs="宋体"/>
           <w:b w:val="0"/>
@@ -1281,14 +1229,8 @@
     </w:p>
     <w:p>
       <w:pPr>
-        <w:pStyle w:val="9"/>
-        <w:keepNext w:val="0"/>
-        <w:keepLines w:val="0"/>
-        <w:widowControl w:val="0"/>
-        <w:suppressLineNumbers w:val="0"/>
-        <w:spacing w:before="0" w:beforeAutospacing="0" w:after="0" w:afterAutospacing="0"/>
-        <w:ind w:left="0" w:right="0"/>
-        <w:jc w:val="both"/>
+        <w:spacing w:line="360" w:lineRule="auto"/>
+        <w:jc w:val="left"/>
         <w:rPr>
           <w:rFonts w:hint="eastAsia" w:ascii="宋体" w:hAnsi="宋体" w:eastAsia="宋体" w:cs="宋体"/>
           <w:b w:val="0"/>
@@ -1314,14 +1256,8 @@
     </w:p>
     <w:p>
       <w:pPr>
-        <w:pStyle w:val="9"/>
-        <w:keepNext w:val="0"/>
-        <w:keepLines w:val="0"/>
-        <w:widowControl w:val="0"/>
-        <w:suppressLineNumbers w:val="0"/>
-        <w:spacing w:before="0" w:beforeAutospacing="0" w:after="0" w:afterAutospacing="0"/>
-        <w:ind w:left="0" w:right="0"/>
-        <w:jc w:val="both"/>
+        <w:spacing w:line="360" w:lineRule="auto"/>
+        <w:jc w:val="left"/>
         <w:rPr>
           <w:rFonts w:hint="eastAsia" w:ascii="宋体" w:hAnsi="宋体" w:eastAsia="宋体" w:cs="宋体"/>
           <w:b w:val="0"/>
@@ -1335,14 +1271,8 @@
     </w:p>
     <w:p>
       <w:pPr>
-        <w:pStyle w:val="9"/>
-        <w:keepNext w:val="0"/>
-        <w:keepLines w:val="0"/>
-        <w:widowControl w:val="0"/>
-        <w:suppressLineNumbers w:val="0"/>
-        <w:spacing w:before="0" w:beforeAutospacing="0" w:after="0" w:afterAutospacing="0"/>
-        <w:ind w:left="0" w:right="0"/>
-        <w:jc w:val="both"/>
+        <w:spacing w:line="360" w:lineRule="auto"/>
+        <w:jc w:val="left"/>
         <w:rPr>
           <w:rFonts w:hint="eastAsia" w:ascii="宋体" w:hAnsi="宋体" w:eastAsia="宋体" w:cs="宋体"/>
           <w:b w:val="0"/>
@@ -1368,14 +1298,8 @@
     </w:p>
     <w:p>
       <w:pPr>
-        <w:pStyle w:val="9"/>
-        <w:keepNext w:val="0"/>
-        <w:keepLines w:val="0"/>
-        <w:widowControl w:val="0"/>
-        <w:suppressLineNumbers w:val="0"/>
-        <w:spacing w:before="0" w:beforeAutospacing="0" w:after="0" w:afterAutospacing="0"/>
-        <w:ind w:left="0" w:right="0"/>
-        <w:jc w:val="both"/>
+        <w:spacing w:line="360" w:lineRule="auto"/>
+        <w:jc w:val="left"/>
         <w:rPr>
           <w:rFonts w:hint="eastAsia" w:ascii="宋体" w:hAnsi="宋体" w:eastAsia="宋体" w:cs="宋体"/>
           <w:b w:val="0"/>
@@ -1417,8 +1341,6 @@
           <w:lang w:val="en-US" w:eastAsia="zh-CN"/>
         </w:rPr>
       </w:pPr>
-      <w:bookmarkStart w:id="0" w:name="_GoBack"/>
-      <w:bookmarkEnd w:id="0"/>
     </w:p>
     <w:sectPr>
       <w:headerReference r:id="rId5" w:type="first"/>

</xml_diff>